<commit_message>
Create basic components for project and adjust document about project
</commit_message>
<xml_diff>
--- a/001 - estudo pessoal/020 - Coffe Shop Network/Manual Passo a Passo servidor de email.docx
+++ b/001 - estudo pessoal/020 - Coffe Shop Network/Manual Passo a Passo servidor de email.docx
@@ -221,7 +221,10 @@
         <w:t>Manual Passo a Passo d</w:t>
       </w:r>
       <w:r>
-        <w:t>a criação do diagrama e funcionalidades da rede</w:t>
+        <w:t xml:space="preserve">a criação </w:t>
+      </w:r>
+      <w:r>
+        <w:t>de uma rede local para uma loja de cafe</w:t>
       </w:r>
     </w:p>
     <w:p/>
@@ -288,7 +291,19 @@
         <w:t>Este relatório</w:t>
       </w:r>
       <w:r>
-        <w:t xml:space="preserve"> tem o objetivo de analisar e justificar as situacoes aprendidas com a operacao de criacao de DHCP utilizando o Cisco packet Tracer para simular, testar e verificar na pratica as operacoes realizadas e as situacoes aprendidas</w:t>
+        <w:t xml:space="preserve"> tem o objetivo de analisar e justificar as situacoes aprendidas com a operacao de criacao d</w:t>
+      </w:r>
+      <w:r>
+        <w:t xml:space="preserve">o primeiro projeto serio pos estudo do curso da CISCO de utilizacao do Cisco packet Tracer nivel inicial e intermerdiario. Irei </w:t>
+      </w:r>
+      <w:r>
+        <w:t>utiliza</w:t>
+      </w:r>
+      <w:r>
+        <w:t>r</w:t>
+      </w:r>
+      <w:r>
+        <w:t xml:space="preserve"> o Cisco packet Tracer para simular, testar e verificar na pratica as operacoes realizadas e as situacoes aprendidas</w:t>
       </w:r>
     </w:p>
     <w:p/>
@@ -325,7 +340,63 @@
           <w:b/>
           <w:bCs/>
         </w:rPr>
-        <w:t xml:space="preserve"> 3 computadores, 1 roteador, 1 servidor;</w:t>
+        <w:t xml:space="preserve"> </w:t>
+      </w:r>
+      <w:r>
+        <w:rPr>
+          <w:b/>
+          <w:bCs/>
+        </w:rPr>
+        <w:t>2</w:t>
+      </w:r>
+      <w:r>
+        <w:rPr>
+          <w:b/>
+          <w:bCs/>
+        </w:rPr>
+        <w:t xml:space="preserve"> computadores</w:t>
+      </w:r>
+      <w:r>
+        <w:rPr>
+          <w:b/>
+          <w:bCs/>
+        </w:rPr>
+        <w:t>, 2 impressoras, 2 notebooks</w:t>
+      </w:r>
+      <w:r>
+        <w:rPr>
+          <w:b/>
+          <w:bCs/>
+        </w:rPr>
+        <w:t xml:space="preserve">, 1 </w:t>
+      </w:r>
+      <w:r>
+        <w:rPr>
+          <w:b/>
+          <w:bCs/>
+        </w:rPr>
+        <w:t>ponto de acesso</w:t>
+      </w:r>
+      <w:r>
+        <w:rPr>
+          <w:b/>
+          <w:bCs/>
+        </w:rPr>
+        <w:t>, 1 servidor</w:t>
+      </w:r>
+      <w:r>
+        <w:rPr>
+          <w:b/>
+          <w:bCs/>
+        </w:rPr>
+        <w:t>, 1 conexao cloud</w:t>
+      </w:r>
+      <w:r>
+        <w:rPr>
+          <w:b/>
+          <w:bCs/>
+        </w:rPr>
+        <w:t>;</w:t>
       </w:r>
     </w:p>
     <w:p>
@@ -489,113 +560,28 @@
         <w:ind w:firstLine="708"/>
       </w:pPr>
       <w:r>
-        <w:t>A operação DHCP (Dynamic Host Configuration Protocol) no Cisco Packet Tracer é a simulação do serviço que atribui automaticamente endereços IP e outras configurações de rede a dispositivos (como PCs, notebooks, celulares) conectados a uma rede.</w:t>
+        <w:t>O objetivo do projeto vai ser simular o primeiro projeto pratico que irei precisar realizar uma montagem de uma rede local em uma loja de cafe, utilizando o Cisco packet tracer</w:t>
+      </w:r>
+      <w:r>
+        <w:t>.</w:t>
       </w:r>
     </w:p>
     <w:p>
       <w:pPr>
         <w:ind w:firstLine="708"/>
       </w:pPr>
-      <w:r>
-        <w:t>No Packet Tracer, você pode configurar esse serviço de duas formas principais: diretamente em um Roteador (usando comandos da CLI) ou em um Servidor (arrastando o ícone de Server da parte inferior da tela e configurando via interface gráfica).</w:t>
-      </w:r>
-    </w:p>
-    <w:p/>
-    <w:p>
-      <w:r>
-        <w:t>Como funciona a operação (O Processo DORA)</w:t>
-      </w:r>
-    </w:p>
-    <w:p>
-      <w:pPr>
-        <w:ind w:left="360"/>
-      </w:pPr>
-      <w:r>
-        <w:t>Quando você liga um PC no Packet Tracer e o configura para obter IP automaticamente (DHCP), ocorre um processo de 4 etapas conhecido como DORA:</w:t>
-      </w:r>
-    </w:p>
-    <w:p>
-      <w:pPr>
-        <w:pStyle w:val="ListParagraph"/>
-        <w:numPr>
-          <w:ilvl w:val="0"/>
-          <w:numId w:val="6"/>
-        </w:numPr>
-      </w:pPr>
-      <w:r>
-        <w:t>Discover (Descoberta): O PC envia uma mensagem em broadcast (para todos) perguntando: "Alguém aí é um servidor DHCP?"</w:t>
-      </w:r>
-    </w:p>
-    <w:p>
-      <w:pPr>
-        <w:pStyle w:val="ListParagraph"/>
-        <w:numPr>
-          <w:ilvl w:val="0"/>
-          <w:numId w:val="6"/>
-        </w:numPr>
-      </w:pPr>
-      <w:r>
-        <w:t>Offer (Oferta): O Roteador/Servidor DHCP ouve a mensagem e responde: "Eu sou! Aqui está um endereço IP que você pode usar."</w:t>
-      </w:r>
-    </w:p>
-    <w:p>
-      <w:pPr>
-        <w:pStyle w:val="ListParagraph"/>
-        <w:numPr>
-          <w:ilvl w:val="0"/>
-          <w:numId w:val="6"/>
-        </w:numPr>
-      </w:pPr>
-      <w:r>
-        <w:t>Request (Solicitação): O PC pega essa oferta e envia outra mensagem: "Quero confirmar o uso desse IP que você me ofereceu."</w:t>
-      </w:r>
-    </w:p>
-    <w:p>
-      <w:pPr>
-        <w:pStyle w:val="ListParagraph"/>
-        <w:numPr>
-          <w:ilvl w:val="0"/>
-          <w:numId w:val="6"/>
-        </w:numPr>
-      </w:pPr>
-      <w:r>
-        <w:t>Acknowledge (Confirmação): O servidor confirma: "Entendido, o IP é agora seu por um tempo determinado (concedido)".</w:t>
-      </w:r>
-    </w:p>
-    <w:p/>
-    <w:p/>
-    <w:p>
-      <w:pPr>
-        <w:pStyle w:val="Heading2"/>
-      </w:pPr>
-      <w:r>
-        <w:br w:type="page"/>
-      </w:r>
-      <w:r>
-        <w:lastRenderedPageBreak/>
-        <w:t>Processo de criacao do projeto</w:t>
-      </w:r>
-    </w:p>
-    <w:p/>
-    <w:p/>
-    <w:p>
-      <w:pPr>
-        <w:pStyle w:val="Heading3"/>
-      </w:pPr>
-      <w:r>
-        <w:t xml:space="preserve">1 – </w:t>
-      </w:r>
-      <w:r>
-        <w:t>Selecionando os computadores, servidores e switch para organizar</w:t>
-      </w:r>
-    </w:p>
-    <w:p>
+    </w:p>
+    <w:p>
+      <w:pPr>
+        <w:ind w:firstLine="708"/>
+        <w:jc w:val="center"/>
+      </w:pPr>
       <w:r>
         <w:drawing>
-          <wp:inline distT="0" distB="0" distL="0" distR="0" wp14:anchorId="54C8710F" wp14:editId="2A17EE2A">
-            <wp:extent cx="5400040" cy="3542030"/>
-            <wp:effectExtent l="0" t="0" r="0" b="1270"/>
-            <wp:docPr id="1066727674" name="Picture 1"/>
+          <wp:inline distT="0" distB="0" distL="0" distR="0" wp14:anchorId="42EE7296" wp14:editId="288DB9D3">
+            <wp:extent cx="4333875" cy="2889250"/>
+            <wp:effectExtent l="0" t="0" r="9525" b="6350"/>
+            <wp:docPr id="1432496680" name="Picture 1"/>
             <wp:cNvGraphicFramePr>
               <a:graphicFrameLocks xmlns:a="http://schemas.openxmlformats.org/drawingml/2006/main" noChangeAspect="1"/>
             </wp:cNvGraphicFramePr>
@@ -603,7 +589,7 @@
               <a:graphicData uri="http://schemas.openxmlformats.org/drawingml/2006/picture">
                 <pic:pic xmlns:pic="http://schemas.openxmlformats.org/drawingml/2006/picture">
                   <pic:nvPicPr>
-                    <pic:cNvPr id="1066727674" name=""/>
+                    <pic:cNvPr id="1432496680" name=""/>
                     <pic:cNvPicPr/>
                   </pic:nvPicPr>
                   <pic:blipFill>
@@ -615,7 +601,7 @@
                   <pic:spPr>
                     <a:xfrm>
                       <a:off x="0" y="0"/>
-                      <a:ext cx="5400040" cy="3542030"/>
+                      <a:ext cx="4334483" cy="2889655"/>
                     </a:xfrm>
                     <a:prstGeom prst="rect">
                       <a:avLst/>
@@ -628,45 +614,30 @@
         </w:drawing>
       </w:r>
     </w:p>
-    <w:p/>
-    <w:p/>
-    <w:p/>
-    <w:p/>
-    <w:p/>
-    <w:p/>
-    <w:p/>
-    <w:p/>
-    <w:p/>
-    <w:p/>
-    <w:p/>
-    <w:p/>
-    <w:p>
-      <w:pPr>
-        <w:pStyle w:val="ListParagraph"/>
-        <w:numPr>
-          <w:ilvl w:val="0"/>
-          <w:numId w:val="10"/>
-        </w:numPr>
-      </w:pPr>
-      <w:r>
-        <w:lastRenderedPageBreak/>
-        <w:t xml:space="preserve">– </w:t>
-      </w:r>
-      <w:r>
-        <w:t xml:space="preserve">Apos isso conectar os cabos nas entradas de cada equipamento. Cabo preto que ser o cabo trancado: </w:t>
-      </w:r>
-    </w:p>
-    <w:p/>
-    <w:p>
-      <w:pPr>
+    <w:p>
+      <w:pPr>
+        <w:ind w:firstLine="708"/>
+      </w:pPr>
+      <w:r>
+        <w:t xml:space="preserve">No projeto irei montar as principais funcionalidades necessarias para o uso: </w:t>
+      </w:r>
+    </w:p>
+    <w:p>
+      <w:pPr>
+        <w:ind w:firstLine="708"/>
+      </w:pPr>
+    </w:p>
+    <w:p>
+      <w:pPr>
+        <w:ind w:firstLine="708"/>
         <w:jc w:val="center"/>
       </w:pPr>
       <w:r>
         <w:drawing>
-          <wp:inline distT="0" distB="0" distL="0" distR="0" wp14:anchorId="6A518933" wp14:editId="4D167FA3">
-            <wp:extent cx="4800600" cy="3028071"/>
-            <wp:effectExtent l="0" t="0" r="0" b="1270"/>
-            <wp:docPr id="254463675" name="Picture 1"/>
+          <wp:inline distT="0" distB="0" distL="0" distR="0" wp14:anchorId="06F63AE4" wp14:editId="15871152">
+            <wp:extent cx="3848100" cy="2567695"/>
+            <wp:effectExtent l="0" t="0" r="0" b="4445"/>
+            <wp:docPr id="2022612250" name="Picture 1"/>
             <wp:cNvGraphicFramePr>
               <a:graphicFrameLocks xmlns:a="http://schemas.openxmlformats.org/drawingml/2006/main" noChangeAspect="1"/>
             </wp:cNvGraphicFramePr>
@@ -674,7 +645,7 @@
               <a:graphicData uri="http://schemas.openxmlformats.org/drawingml/2006/picture">
                 <pic:pic xmlns:pic="http://schemas.openxmlformats.org/drawingml/2006/picture">
                   <pic:nvPicPr>
-                    <pic:cNvPr id="254463675" name=""/>
+                    <pic:cNvPr id="2022612250" name=""/>
                     <pic:cNvPicPr/>
                   </pic:nvPicPr>
                   <pic:blipFill>
@@ -686,7 +657,7 @@
                   <pic:spPr>
                     <a:xfrm>
                       <a:off x="0" y="0"/>
-                      <a:ext cx="4807483" cy="3032413"/>
+                      <a:ext cx="3854896" cy="2572230"/>
                     </a:xfrm>
                     <a:prstGeom prst="rect">
                       <a:avLst/>
@@ -701,80 +672,32 @@
     </w:p>
     <w:p>
       <w:pPr>
-        <w:pStyle w:val="ListParagraph"/>
-        <w:numPr>
-          <w:ilvl w:val="1"/>
-          <w:numId w:val="10"/>
-        </w:numPr>
-      </w:pPr>
-      <w:r>
-        <w:t>– Do servidor 0 conectar na unica entrada FastEthernet0 no switch0 pela entrada FastEthernet0/1;</w:t>
-      </w:r>
-    </w:p>
-    <w:p>
-      <w:pPr>
-        <w:pStyle w:val="ListParagraph"/>
-        <w:numPr>
-          <w:ilvl w:val="1"/>
-          <w:numId w:val="10"/>
-        </w:numPr>
-      </w:pPr>
-      <w:r>
-        <w:t xml:space="preserve"> - Do servidor 1 conectar na unica entrada FastEthernet0 no switch0 pela entrada FastEthernet0/2;</w:t>
-      </w:r>
-    </w:p>
-    <w:p>
-      <w:pPr>
-        <w:pStyle w:val="ListParagraph"/>
-        <w:numPr>
-          <w:ilvl w:val="1"/>
-          <w:numId w:val="10"/>
-        </w:numPr>
-      </w:pPr>
-      <w:r>
-        <w:t>– Do Switch0 conectar na entrada FastEthernet0/3 no PC0 pela entrada FastEthernet0</w:t>
-      </w:r>
-    </w:p>
-    <w:p>
-      <w:pPr>
-        <w:pStyle w:val="ListParagraph"/>
-        <w:numPr>
-          <w:ilvl w:val="1"/>
-          <w:numId w:val="10"/>
-        </w:numPr>
-      </w:pPr>
-      <w:r>
-        <w:t xml:space="preserve"> - Do Switch 0 conectar na entrada FastEthernet0/4 no PC0 pela entrada FastEthernet0</w:t>
-      </w:r>
-    </w:p>
-    <w:p/>
-    <w:p>
-      <w:pPr>
-        <w:pStyle w:val="ListParagraph"/>
-        <w:numPr>
-          <w:ilvl w:val="0"/>
-          <w:numId w:val="10"/>
-        </w:numPr>
-      </w:pPr>
-      <w:r>
-        <w:t xml:space="preserve">– </w:t>
-      </w:r>
-      <w:r>
-        <w:t xml:space="preserve">Entrar no menu do Servidor 0 e alterar o nome, acessando menu </w:t>
-      </w:r>
-    </w:p>
-    <w:p>
-      <w:r>
-        <w:t>servidor0 -&gt; Config -&gt; settings. Em seguida ir na aba display Name e alterar o nome.</w:t>
-      </w:r>
-    </w:p>
-    <w:p>
-      <w:r>
+        <w:ind w:firstLine="708"/>
+      </w:pPr>
+      <w:r>
+        <w:t>O acesso dos usuarios ao ponto de acesso para wifi livre e internet disponivel</w:t>
+      </w:r>
+      <w:r>
+        <w:t>.</w:t>
+      </w:r>
+    </w:p>
+    <w:p>
+      <w:pPr>
+        <w:ind w:firstLine="708"/>
+      </w:pPr>
+    </w:p>
+    <w:p>
+      <w:pPr>
+        <w:ind w:firstLine="708"/>
+        <w:jc w:val="center"/>
+      </w:pPr>
+      <w:r>
+        <w:lastRenderedPageBreak/>
         <w:drawing>
-          <wp:inline distT="0" distB="0" distL="0" distR="0" wp14:anchorId="383CABE5" wp14:editId="60C6702A">
-            <wp:extent cx="5400040" cy="1981200"/>
+          <wp:inline distT="0" distB="0" distL="0" distR="0" wp14:anchorId="79D31C53" wp14:editId="0049FAE4">
+            <wp:extent cx="4314825" cy="2858572"/>
             <wp:effectExtent l="0" t="0" r="0" b="0"/>
-            <wp:docPr id="1411884806" name="Picture 1"/>
+            <wp:docPr id="1151802135" name="Picture 1"/>
             <wp:cNvGraphicFramePr>
               <a:graphicFrameLocks xmlns:a="http://schemas.openxmlformats.org/drawingml/2006/main" noChangeAspect="1"/>
             </wp:cNvGraphicFramePr>
@@ -782,7 +705,7 @@
               <a:graphicData uri="http://schemas.openxmlformats.org/drawingml/2006/picture">
                 <pic:pic xmlns:pic="http://schemas.openxmlformats.org/drawingml/2006/picture">
                   <pic:nvPicPr>
-                    <pic:cNvPr id="1411884806" name=""/>
+                    <pic:cNvPr id="1151802135" name=""/>
                     <pic:cNvPicPr/>
                   </pic:nvPicPr>
                   <pic:blipFill>
@@ -794,7 +717,7 @@
                   <pic:spPr>
                     <a:xfrm>
                       <a:off x="0" y="0"/>
-                      <a:ext cx="5400040" cy="1981200"/>
+                      <a:ext cx="4319780" cy="2861855"/>
                     </a:xfrm>
                     <a:prstGeom prst="rect">
                       <a:avLst/>
@@ -807,26 +730,33 @@
         </w:drawing>
       </w:r>
     </w:p>
-    <w:p/>
-    <w:p>
-      <w:r>
-        <w:lastRenderedPageBreak/>
-        <w:t>4 –</w:t>
-      </w:r>
-      <w:r>
-        <w:t>Dentro do servidor0 FTP configurar um IP estatico para realizar algumas operacoes. O IP configurado foi 192.168.1.100 com mascara 255.255.255.0</w:t>
-      </w:r>
-    </w:p>
-    <w:p>
-      <w:pPr>
+    <w:p>
+      <w:pPr>
+        <w:ind w:firstLine="708"/>
+      </w:pPr>
+      <w:r>
+        <w:t>O</w:t>
+      </w:r>
+      <w:r>
+        <w:t xml:space="preserve"> sistema de uso por parte da gerencia do escritorio </w:t>
+      </w:r>
+    </w:p>
+    <w:p>
+      <w:pPr>
+        <w:ind w:firstLine="708"/>
+      </w:pPr>
+    </w:p>
+    <w:p>
+      <w:pPr>
+        <w:ind w:firstLine="708"/>
         <w:jc w:val="center"/>
       </w:pPr>
       <w:r>
         <w:drawing>
-          <wp:inline distT="0" distB="0" distL="0" distR="0" wp14:anchorId="6B38BF36" wp14:editId="7AAA1776">
-            <wp:extent cx="5400040" cy="4267835"/>
+          <wp:inline distT="0" distB="0" distL="0" distR="0" wp14:anchorId="57674317" wp14:editId="1E503677">
+            <wp:extent cx="4276725" cy="2846050"/>
             <wp:effectExtent l="0" t="0" r="0" b="0"/>
-            <wp:docPr id="636775106" name="Picture 1"/>
+            <wp:docPr id="1942553355" name="Picture 1"/>
             <wp:cNvGraphicFramePr>
               <a:graphicFrameLocks xmlns:a="http://schemas.openxmlformats.org/drawingml/2006/main" noChangeAspect="1"/>
             </wp:cNvGraphicFramePr>
@@ -834,7 +764,7 @@
               <a:graphicData uri="http://schemas.openxmlformats.org/drawingml/2006/picture">
                 <pic:pic xmlns:pic="http://schemas.openxmlformats.org/drawingml/2006/picture">
                   <pic:nvPicPr>
-                    <pic:cNvPr id="636775106" name=""/>
+                    <pic:cNvPr id="1942553355" name=""/>
                     <pic:cNvPicPr/>
                   </pic:nvPicPr>
                   <pic:blipFill>
@@ -846,7 +776,7 @@
                   <pic:spPr>
                     <a:xfrm>
                       <a:off x="0" y="0"/>
-                      <a:ext cx="5400040" cy="4267835"/>
+                      <a:ext cx="4283474" cy="2850541"/>
                     </a:xfrm>
                     <a:prstGeom prst="rect">
                       <a:avLst/>
@@ -859,37 +789,55 @@
         </w:drawing>
       </w:r>
     </w:p>
-    <w:p/>
-    <w:p/>
-    <w:p/>
-    <w:p/>
-    <w:p/>
-    <w:p/>
-    <w:p/>
-    <w:p/>
-    <w:p/>
-    <w:p/>
-    <w:p/>
-    <w:p/>
-    <w:p>
+    <w:p>
+      <w:pPr>
+        <w:ind w:firstLine="708"/>
+      </w:pPr>
+      <w:r>
+        <w:t>O</w:t>
+      </w:r>
+      <w:r>
+        <w:t xml:space="preserve"> computador para registrar o pedido e imprimir notas</w:t>
+      </w:r>
+      <w:r>
+        <w:t>.</w:t>
+      </w:r>
+    </w:p>
+    <w:p/>
+    <w:p/>
+    <w:p/>
+    <w:p>
+      <w:pPr>
+        <w:pStyle w:val="Heading2"/>
+      </w:pPr>
+      <w:r>
+        <w:br w:type="page"/>
+      </w:r>
       <w:r>
         <w:lastRenderedPageBreak/>
-        <w:t xml:space="preserve"> 5 – </w:t>
-      </w:r>
-      <w:r>
-        <w:t>Configurar Ips estaticos para o computador 0 e o computador 1. Para o computador 0 foi colocado o IP 192.168.1.2 e para o computador 1 foi colocado o IP 192.168.1.3</w:t>
-      </w:r>
-    </w:p>
-    <w:p>
-      <w:pPr>
-        <w:jc w:val="center"/>
-      </w:pPr>
+        <w:t>Processo de criacao do projeto</w:t>
+      </w:r>
+    </w:p>
+    <w:p/>
+    <w:p/>
+    <w:p>
+      <w:pPr>
+        <w:pStyle w:val="Heading3"/>
+      </w:pPr>
+      <w:r>
+        <w:t xml:space="preserve">1 – </w:t>
+      </w:r>
+      <w:r>
+        <w:t>Organizando os itens a serem utilizados no projeto da rede local da cafeteria</w:t>
+      </w:r>
+    </w:p>
+    <w:p>
       <w:r>
         <w:drawing>
-          <wp:inline distT="0" distB="0" distL="0" distR="0" wp14:anchorId="11F8F4E8" wp14:editId="14A4E3FB">
-            <wp:extent cx="5053062" cy="3810000"/>
+          <wp:inline distT="0" distB="0" distL="0" distR="0" wp14:anchorId="4B0FCC03" wp14:editId="661C04C7">
+            <wp:extent cx="5400040" cy="3435985"/>
             <wp:effectExtent l="0" t="0" r="0" b="0"/>
-            <wp:docPr id="289889719" name="Picture 1"/>
+            <wp:docPr id="1800053596" name="Picture 1"/>
             <wp:cNvGraphicFramePr>
               <a:graphicFrameLocks xmlns:a="http://schemas.openxmlformats.org/drawingml/2006/main" noChangeAspect="1"/>
             </wp:cNvGraphicFramePr>
@@ -897,7 +845,7 @@
               <a:graphicData uri="http://schemas.openxmlformats.org/drawingml/2006/picture">
                 <pic:pic xmlns:pic="http://schemas.openxmlformats.org/drawingml/2006/picture">
                   <pic:nvPicPr>
-                    <pic:cNvPr id="289889719" name=""/>
+                    <pic:cNvPr id="1800053596" name=""/>
                     <pic:cNvPicPr/>
                   </pic:nvPicPr>
                   <pic:blipFill>
@@ -909,7 +857,7 @@
                   <pic:spPr>
                     <a:xfrm>
                       <a:off x="0" y="0"/>
-                      <a:ext cx="5059137" cy="3814581"/>
+                      <a:ext cx="5400040" cy="3435985"/>
                     </a:xfrm>
                     <a:prstGeom prst="rect">
                       <a:avLst/>
@@ -924,1021 +872,77 @@
     </w:p>
     <w:p/>
     <w:p>
-      <w:pPr>
-        <w:jc w:val="center"/>
-      </w:pPr>
-      <w:r>
-        <w:drawing>
-          <wp:inline distT="0" distB="0" distL="0" distR="0" wp14:anchorId="6B3724B6" wp14:editId="53480EB7">
-            <wp:extent cx="5252256" cy="3971925"/>
-            <wp:effectExtent l="0" t="0" r="5715" b="0"/>
-            <wp:docPr id="1212341" name="Picture 1"/>
-            <wp:cNvGraphicFramePr>
-              <a:graphicFrameLocks xmlns:a="http://schemas.openxmlformats.org/drawingml/2006/main" noChangeAspect="1"/>
-            </wp:cNvGraphicFramePr>
-            <a:graphic xmlns:a="http://schemas.openxmlformats.org/drawingml/2006/main">
-              <a:graphicData uri="http://schemas.openxmlformats.org/drawingml/2006/picture">
-                <pic:pic xmlns:pic="http://schemas.openxmlformats.org/drawingml/2006/picture">
-                  <pic:nvPicPr>
-                    <pic:cNvPr id="1212341" name=""/>
-                    <pic:cNvPicPr/>
-                  </pic:nvPicPr>
-                  <pic:blipFill>
-                    <a:blip r:embed="rId11"/>
-                    <a:stretch>
-                      <a:fillRect/>
-                    </a:stretch>
-                  </pic:blipFill>
-                  <pic:spPr>
-                    <a:xfrm>
-                      <a:off x="0" y="0"/>
-                      <a:ext cx="5257218" cy="3975678"/>
-                    </a:xfrm>
-                    <a:prstGeom prst="rect">
-                      <a:avLst/>
-                    </a:prstGeom>
-                  </pic:spPr>
-                </pic:pic>
-              </a:graphicData>
-            </a:graphic>
-          </wp:inline>
-        </w:drawing>
-      </w:r>
-    </w:p>
-    <w:p>
-      <w:r>
-        <w:lastRenderedPageBreak/>
-        <w:t xml:space="preserve">6 – </w:t>
-      </w:r>
-      <w:r>
-        <w:t>Apos isso sera necessario acessar o servidor 0 FTP e seguir a seguinte opcao. Menu servidor FTP -&gt; Services -&gt; FTP. Acessando essa paguina sera necessario criar um usuario para acessar o servidor.</w:t>
-      </w:r>
-    </w:p>
-    <w:p>
-      <w:r>
-        <w:drawing>
-          <wp:inline distT="0" distB="0" distL="0" distR="0" wp14:anchorId="3A7178FC" wp14:editId="203BD0F7">
-            <wp:extent cx="5400040" cy="4688205"/>
-            <wp:effectExtent l="0" t="0" r="0" b="0"/>
-            <wp:docPr id="1232134232" name="Picture 1"/>
-            <wp:cNvGraphicFramePr>
-              <a:graphicFrameLocks xmlns:a="http://schemas.openxmlformats.org/drawingml/2006/main" noChangeAspect="1"/>
-            </wp:cNvGraphicFramePr>
-            <a:graphic xmlns:a="http://schemas.openxmlformats.org/drawingml/2006/main">
-              <a:graphicData uri="http://schemas.openxmlformats.org/drawingml/2006/picture">
-                <pic:pic xmlns:pic="http://schemas.openxmlformats.org/drawingml/2006/picture">
-                  <pic:nvPicPr>
-                    <pic:cNvPr id="1232134232" name=""/>
-                    <pic:cNvPicPr/>
-                  </pic:nvPicPr>
-                  <pic:blipFill>
-                    <a:blip r:embed="rId12"/>
-                    <a:stretch>
-                      <a:fillRect/>
-                    </a:stretch>
-                  </pic:blipFill>
-                  <pic:spPr>
-                    <a:xfrm>
-                      <a:off x="0" y="0"/>
-                      <a:ext cx="5400040" cy="4688205"/>
-                    </a:xfrm>
-                    <a:prstGeom prst="rect">
-                      <a:avLst/>
-                    </a:prstGeom>
-                  </pic:spPr>
-                </pic:pic>
-              </a:graphicData>
-            </a:graphic>
-          </wp:inline>
-        </w:drawing>
-      </w:r>
-    </w:p>
-    <w:p/>
-    <w:p/>
-    <w:p/>
-    <w:p/>
-    <w:p/>
-    <w:p/>
-    <w:p/>
-    <w:p/>
-    <w:p/>
-    <w:p/>
-    <w:p/>
-    <w:p>
-      <w:r>
-        <w:lastRenderedPageBreak/>
-        <w:t xml:space="preserve">7 – </w:t>
-      </w:r>
-      <w:r>
-        <w:t>Apos acessar sera necessario criar um usuario e dar acesso para ele de escrever e ler, e ai em seguida apertar o botao de add para criar</w:t>
-      </w:r>
-    </w:p>
-    <w:p>
-      <w:pPr>
-        <w:jc w:val="center"/>
-      </w:pPr>
-      <w:r>
-        <w:drawing>
-          <wp:inline distT="0" distB="0" distL="0" distR="0" wp14:anchorId="4B57DD02" wp14:editId="713F8E1C">
-            <wp:extent cx="5400040" cy="3349625"/>
-            <wp:effectExtent l="0" t="0" r="0" b="3175"/>
-            <wp:docPr id="65346245" name="Picture 1"/>
-            <wp:cNvGraphicFramePr>
-              <a:graphicFrameLocks xmlns:a="http://schemas.openxmlformats.org/drawingml/2006/main" noChangeAspect="1"/>
-            </wp:cNvGraphicFramePr>
-            <a:graphic xmlns:a="http://schemas.openxmlformats.org/drawingml/2006/main">
-              <a:graphicData uri="http://schemas.openxmlformats.org/drawingml/2006/picture">
-                <pic:pic xmlns:pic="http://schemas.openxmlformats.org/drawingml/2006/picture">
-                  <pic:nvPicPr>
-                    <pic:cNvPr id="65346245" name=""/>
-                    <pic:cNvPicPr/>
-                  </pic:nvPicPr>
-                  <pic:blipFill>
-                    <a:blip r:embed="rId13"/>
-                    <a:stretch>
-                      <a:fillRect/>
-                    </a:stretch>
-                  </pic:blipFill>
-                  <pic:spPr>
-                    <a:xfrm>
-                      <a:off x="0" y="0"/>
-                      <a:ext cx="5400040" cy="3349625"/>
-                    </a:xfrm>
-                    <a:prstGeom prst="rect">
-                      <a:avLst/>
-                    </a:prstGeom>
-                  </pic:spPr>
-                </pic:pic>
-              </a:graphicData>
-            </a:graphic>
-          </wp:inline>
-        </w:drawing>
-      </w:r>
-    </w:p>
-    <w:p/>
-    <w:p>
-      <w:r>
-        <w:drawing>
-          <wp:inline distT="0" distB="0" distL="0" distR="0" wp14:anchorId="4470F8B1" wp14:editId="4B094195">
-            <wp:extent cx="5400040" cy="2368550"/>
-            <wp:effectExtent l="0" t="0" r="0" b="0"/>
-            <wp:docPr id="164441218" name="Picture 1"/>
-            <wp:cNvGraphicFramePr>
-              <a:graphicFrameLocks xmlns:a="http://schemas.openxmlformats.org/drawingml/2006/main" noChangeAspect="1"/>
-            </wp:cNvGraphicFramePr>
-            <a:graphic xmlns:a="http://schemas.openxmlformats.org/drawingml/2006/main">
-              <a:graphicData uri="http://schemas.openxmlformats.org/drawingml/2006/picture">
-                <pic:pic xmlns:pic="http://schemas.openxmlformats.org/drawingml/2006/picture">
-                  <pic:nvPicPr>
-                    <pic:cNvPr id="164441218" name=""/>
-                    <pic:cNvPicPr/>
-                  </pic:nvPicPr>
-                  <pic:blipFill>
-                    <a:blip r:embed="rId14"/>
-                    <a:stretch>
-                      <a:fillRect/>
-                    </a:stretch>
-                  </pic:blipFill>
-                  <pic:spPr>
-                    <a:xfrm>
-                      <a:off x="0" y="0"/>
-                      <a:ext cx="5400040" cy="2368550"/>
-                    </a:xfrm>
-                    <a:prstGeom prst="rect">
-                      <a:avLst/>
-                    </a:prstGeom>
-                  </pic:spPr>
-                </pic:pic>
-              </a:graphicData>
-            </a:graphic>
-          </wp:inline>
-        </w:drawing>
-      </w:r>
-    </w:p>
-    <w:p/>
-    <w:p/>
-    <w:p/>
-    <w:p/>
-    <w:p/>
-    <w:p/>
-    <w:p/>
-    <w:p>
-      <w:r>
-        <w:lastRenderedPageBreak/>
-        <w:t xml:space="preserve">8 – </w:t>
-      </w:r>
-      <w:r>
-        <w:t>Em seguida sera todo o processo de acessar o servidor FTP atravez do computador 0, criar um arquivo pelo usuario admin criado e em seguida usar o computador 1 para acessar e ler o arquivo criado</w:t>
-      </w:r>
-      <w:r>
-        <w:t xml:space="preserve"> pelo computador 0 usando o usuario admin criado.</w:t>
-      </w:r>
-    </w:p>
-    <w:p>
-      <w:r>
-        <w:t>No computador</w:t>
-      </w:r>
-      <w:r>
-        <w:t xml:space="preserve"> 0 acessar o propt de comando atraves do </w:t>
-      </w:r>
-    </w:p>
-    <w:p>
-      <w:pPr>
-        <w:rPr>
-          <w:lang w:val="en-US"/>
-        </w:rPr>
-      </w:pPr>
-      <w:r>
-        <w:rPr>
-          <w:lang w:val="en-US"/>
-        </w:rPr>
-        <w:t xml:space="preserve">menu </w:t>
-      </w:r>
-      <w:proofErr w:type="spellStart"/>
-      <w:r>
-        <w:rPr>
-          <w:lang w:val="en-US"/>
-        </w:rPr>
-        <w:t>computador</w:t>
-      </w:r>
-      <w:proofErr w:type="spellEnd"/>
-      <w:r>
-        <w:rPr>
-          <w:lang w:val="en-US"/>
-        </w:rPr>
-        <w:t xml:space="preserve"> 0 -&gt; DESKTOP -&gt; Command Pro</w:t>
-      </w:r>
-      <w:r>
-        <w:rPr>
-          <w:lang w:val="en-US"/>
-        </w:rPr>
-        <w:t>mpt</w:t>
-      </w:r>
-    </w:p>
-    <w:p>
-      <w:r>
-        <w:t xml:space="preserve">e ai digitar </w:t>
-      </w:r>
-      <w:r>
-        <w:t>a operacao e o ip do servidor, depois a senha do unico usuario para poder acessar e logar</w:t>
-      </w:r>
-    </w:p>
-    <w:p>
-      <w:r>
-        <w:drawing>
-          <wp:inline distT="0" distB="0" distL="0" distR="0" wp14:anchorId="02CEE800" wp14:editId="56A6FFD2">
-            <wp:extent cx="3629532" cy="2972215"/>
-            <wp:effectExtent l="0" t="0" r="9525" b="0"/>
-            <wp:docPr id="2087338984" name="Picture 1"/>
-            <wp:cNvGraphicFramePr>
-              <a:graphicFrameLocks xmlns:a="http://schemas.openxmlformats.org/drawingml/2006/main" noChangeAspect="1"/>
-            </wp:cNvGraphicFramePr>
-            <a:graphic xmlns:a="http://schemas.openxmlformats.org/drawingml/2006/main">
-              <a:graphicData uri="http://schemas.openxmlformats.org/drawingml/2006/picture">
-                <pic:pic xmlns:pic="http://schemas.openxmlformats.org/drawingml/2006/picture">
-                  <pic:nvPicPr>
-                    <pic:cNvPr id="2087338984" name=""/>
-                    <pic:cNvPicPr/>
-                  </pic:nvPicPr>
-                  <pic:blipFill>
-                    <a:blip r:embed="rId15"/>
-                    <a:stretch>
-                      <a:fillRect/>
-                    </a:stretch>
-                  </pic:blipFill>
-                  <pic:spPr>
-                    <a:xfrm>
-                      <a:off x="0" y="0"/>
-                      <a:ext cx="3629532" cy="2972215"/>
-                    </a:xfrm>
-                    <a:prstGeom prst="rect">
-                      <a:avLst/>
-                    </a:prstGeom>
-                  </pic:spPr>
-                </pic:pic>
-              </a:graphicData>
-            </a:graphic>
-          </wp:inline>
-        </w:drawing>
-      </w:r>
-    </w:p>
-    <w:p/>
-    <w:p/>
-    <w:p/>
-    <w:p/>
-    <w:p/>
-    <w:p/>
-    <w:p/>
-    <w:p/>
-    <w:p/>
-    <w:p/>
-    <w:p/>
-    <w:p/>
-    <w:p/>
-    <w:p>
-      <w:r>
-        <w:lastRenderedPageBreak/>
-        <w:t xml:space="preserve">9 – </w:t>
-      </w:r>
-      <w:r>
-        <w:t>Apos estar logado poderei acessar o text editer para criar um arquivo e tentar salvalo dentro do servidor FTP para realizar os teste de arquivos dentro dele</w:t>
-      </w:r>
-    </w:p>
-    <w:p>
-      <w:pPr>
-        <w:jc w:val="center"/>
-      </w:pPr>
-      <w:r>
-        <w:drawing>
-          <wp:inline distT="0" distB="0" distL="0" distR="0" wp14:anchorId="642CEEC2" wp14:editId="61456026">
-            <wp:extent cx="5400040" cy="4248150"/>
-            <wp:effectExtent l="0" t="0" r="0" b="0"/>
-            <wp:docPr id="1866165415" name="Picture 1"/>
-            <wp:cNvGraphicFramePr>
-              <a:graphicFrameLocks xmlns:a="http://schemas.openxmlformats.org/drawingml/2006/main" noChangeAspect="1"/>
-            </wp:cNvGraphicFramePr>
-            <a:graphic xmlns:a="http://schemas.openxmlformats.org/drawingml/2006/main">
-              <a:graphicData uri="http://schemas.openxmlformats.org/drawingml/2006/picture">
-                <pic:pic xmlns:pic="http://schemas.openxmlformats.org/drawingml/2006/picture">
-                  <pic:nvPicPr>
-                    <pic:cNvPr id="1866165415" name=""/>
-                    <pic:cNvPicPr/>
-                  </pic:nvPicPr>
-                  <pic:blipFill>
-                    <a:blip r:embed="rId16"/>
-                    <a:stretch>
-                      <a:fillRect/>
-                    </a:stretch>
-                  </pic:blipFill>
-                  <pic:spPr>
-                    <a:xfrm>
-                      <a:off x="0" y="0"/>
-                      <a:ext cx="5400040" cy="4248150"/>
-                    </a:xfrm>
-                    <a:prstGeom prst="rect">
-                      <a:avLst/>
-                    </a:prstGeom>
-                  </pic:spPr>
-                </pic:pic>
-              </a:graphicData>
-            </a:graphic>
-          </wp:inline>
-        </w:drawing>
-      </w:r>
-    </w:p>
-    <w:p>
-      <w:pPr>
-        <w:jc w:val="center"/>
-      </w:pPr>
-    </w:p>
-    <w:p>
-      <w:pPr>
-        <w:jc w:val="center"/>
-      </w:pPr>
-      <w:r>
-        <w:drawing>
-          <wp:inline distT="0" distB="0" distL="0" distR="0" wp14:anchorId="1BB42FFF" wp14:editId="4C200A01">
-            <wp:extent cx="5400040" cy="2127250"/>
-            <wp:effectExtent l="0" t="0" r="0" b="6350"/>
-            <wp:docPr id="1529733082" name="Picture 1"/>
-            <wp:cNvGraphicFramePr>
-              <a:graphicFrameLocks xmlns:a="http://schemas.openxmlformats.org/drawingml/2006/main" noChangeAspect="1"/>
-            </wp:cNvGraphicFramePr>
-            <a:graphic xmlns:a="http://schemas.openxmlformats.org/drawingml/2006/main">
-              <a:graphicData uri="http://schemas.openxmlformats.org/drawingml/2006/picture">
-                <pic:pic xmlns:pic="http://schemas.openxmlformats.org/drawingml/2006/picture">
-                  <pic:nvPicPr>
-                    <pic:cNvPr id="1529733082" name=""/>
-                    <pic:cNvPicPr/>
-                  </pic:nvPicPr>
-                  <pic:blipFill>
-                    <a:blip r:embed="rId17"/>
-                    <a:stretch>
-                      <a:fillRect/>
-                    </a:stretch>
-                  </pic:blipFill>
-                  <pic:spPr>
-                    <a:xfrm>
-                      <a:off x="0" y="0"/>
-                      <a:ext cx="5400040" cy="2127250"/>
-                    </a:xfrm>
-                    <a:prstGeom prst="rect">
-                      <a:avLst/>
-                    </a:prstGeom>
-                  </pic:spPr>
-                </pic:pic>
-              </a:graphicData>
-            </a:graphic>
-          </wp:inline>
-        </w:drawing>
-      </w:r>
-    </w:p>
-    <w:p>
-      <w:pPr>
-        <w:jc w:val="center"/>
-      </w:pPr>
-    </w:p>
-    <w:p>
-      <w:pPr>
-        <w:jc w:val="center"/>
-      </w:pPr>
-      <w:r>
-        <w:lastRenderedPageBreak/>
-        <w:drawing>
-          <wp:inline distT="0" distB="0" distL="0" distR="0" wp14:anchorId="1936277B" wp14:editId="19C5228C">
-            <wp:extent cx="4953000" cy="2054819"/>
-            <wp:effectExtent l="0" t="0" r="0" b="3175"/>
-            <wp:docPr id="101593209" name="Picture 1"/>
-            <wp:cNvGraphicFramePr>
-              <a:graphicFrameLocks xmlns:a="http://schemas.openxmlformats.org/drawingml/2006/main" noChangeAspect="1"/>
-            </wp:cNvGraphicFramePr>
-            <a:graphic xmlns:a="http://schemas.openxmlformats.org/drawingml/2006/main">
-              <a:graphicData uri="http://schemas.openxmlformats.org/drawingml/2006/picture">
-                <pic:pic xmlns:pic="http://schemas.openxmlformats.org/drawingml/2006/picture">
-                  <pic:nvPicPr>
-                    <pic:cNvPr id="101593209" name=""/>
-                    <pic:cNvPicPr/>
-                  </pic:nvPicPr>
-                  <pic:blipFill>
-                    <a:blip r:embed="rId18"/>
-                    <a:stretch>
-                      <a:fillRect/>
-                    </a:stretch>
-                  </pic:blipFill>
-                  <pic:spPr>
-                    <a:xfrm>
-                      <a:off x="0" y="0"/>
-                      <a:ext cx="4958792" cy="2057222"/>
-                    </a:xfrm>
-                    <a:prstGeom prst="rect">
-                      <a:avLst/>
-                    </a:prstGeom>
-                  </pic:spPr>
-                </pic:pic>
-              </a:graphicData>
-            </a:graphic>
-          </wp:inline>
-        </w:drawing>
-      </w:r>
-    </w:p>
-    <w:p>
-      <w:pPr>
-        <w:jc w:val="center"/>
-      </w:pPr>
-    </w:p>
-    <w:p>
-      <w:pPr>
-        <w:jc w:val="center"/>
-      </w:pPr>
-      <w:r>
-        <w:drawing>
-          <wp:inline distT="0" distB="0" distL="0" distR="0" wp14:anchorId="60FE7775" wp14:editId="7607CBDC">
-            <wp:extent cx="5149250" cy="1981200"/>
-            <wp:effectExtent l="0" t="0" r="0" b="0"/>
-            <wp:docPr id="117196878" name="Picture 1"/>
-            <wp:cNvGraphicFramePr>
-              <a:graphicFrameLocks xmlns:a="http://schemas.openxmlformats.org/drawingml/2006/main" noChangeAspect="1"/>
-            </wp:cNvGraphicFramePr>
-            <a:graphic xmlns:a="http://schemas.openxmlformats.org/drawingml/2006/main">
-              <a:graphicData uri="http://schemas.openxmlformats.org/drawingml/2006/picture">
-                <pic:pic xmlns:pic="http://schemas.openxmlformats.org/drawingml/2006/picture">
-                  <pic:nvPicPr>
-                    <pic:cNvPr id="117196878" name=""/>
-                    <pic:cNvPicPr/>
-                  </pic:nvPicPr>
-                  <pic:blipFill>
-                    <a:blip r:embed="rId19"/>
-                    <a:stretch>
-                      <a:fillRect/>
-                    </a:stretch>
-                  </pic:blipFill>
-                  <pic:spPr>
-                    <a:xfrm>
-                      <a:off x="0" y="0"/>
-                      <a:ext cx="5161399" cy="1985874"/>
-                    </a:xfrm>
-                    <a:prstGeom prst="rect">
-                      <a:avLst/>
-                    </a:prstGeom>
-                  </pic:spPr>
-                </pic:pic>
-              </a:graphicData>
-            </a:graphic>
-          </wp:inline>
-        </w:drawing>
-      </w:r>
-    </w:p>
-    <w:p>
-      <w:pPr>
-        <w:jc w:val="center"/>
-      </w:pPr>
-    </w:p>
-    <w:p>
-      <w:pPr>
-        <w:jc w:val="center"/>
-      </w:pPr>
-      <w:r>
-        <w:t xml:space="preserve">10 – Depois disso sera apena necessario acessar o </w:t>
-      </w:r>
-      <w:r>
-        <w:t xml:space="preserve">commando prompt para mandar os arquivos para o servidor ja que ja entramos dentro do servido para as operacoes </w:t>
-      </w:r>
-    </w:p>
-    <w:p>
-      <w:pPr>
-        <w:jc w:val="center"/>
-        <w:rPr>
-          <w:b/>
-          <w:bCs/>
-        </w:rPr>
-      </w:pPr>
-      <w:r>
-        <w:drawing>
-          <wp:inline distT="0" distB="0" distL="0" distR="0" wp14:anchorId="6804910A" wp14:editId="20A13E19">
-            <wp:extent cx="3442134" cy="3343275"/>
-            <wp:effectExtent l="0" t="0" r="6350" b="0"/>
-            <wp:docPr id="801722323" name="Picture 1"/>
-            <wp:cNvGraphicFramePr>
-              <a:graphicFrameLocks xmlns:a="http://schemas.openxmlformats.org/drawingml/2006/main" noChangeAspect="1"/>
-            </wp:cNvGraphicFramePr>
-            <a:graphic xmlns:a="http://schemas.openxmlformats.org/drawingml/2006/main">
-              <a:graphicData uri="http://schemas.openxmlformats.org/drawingml/2006/picture">
-                <pic:pic xmlns:pic="http://schemas.openxmlformats.org/drawingml/2006/picture">
-                  <pic:nvPicPr>
-                    <pic:cNvPr id="801722323" name=""/>
-                    <pic:cNvPicPr/>
-                  </pic:nvPicPr>
-                  <pic:blipFill>
-                    <a:blip r:embed="rId20"/>
-                    <a:stretch>
-                      <a:fillRect/>
-                    </a:stretch>
-                  </pic:blipFill>
-                  <pic:spPr>
-                    <a:xfrm>
-                      <a:off x="0" y="0"/>
-                      <a:ext cx="3458833" cy="3359495"/>
-                    </a:xfrm>
-                    <a:prstGeom prst="rect">
-                      <a:avLst/>
-                    </a:prstGeom>
-                  </pic:spPr>
-                </pic:pic>
-              </a:graphicData>
-            </a:graphic>
-          </wp:inline>
-        </w:drawing>
-      </w:r>
-    </w:p>
-    <w:p>
-      <w:pPr>
-        <w:jc w:val="center"/>
-      </w:pPr>
-      <w:r>
-        <w:lastRenderedPageBreak/>
-        <w:t xml:space="preserve">11 – </w:t>
-      </w:r>
-      <w:r>
-        <w:t>apos mandar o arquivo para o servidor FTP sera necessario sair dedentro do servidor atraves do comando quit</w:t>
-      </w:r>
-    </w:p>
-    <w:p>
-      <w:pPr>
-        <w:jc w:val="center"/>
-      </w:pPr>
-      <w:r>
-        <w:drawing>
-          <wp:inline distT="0" distB="0" distL="0" distR="0" wp14:anchorId="079527C0" wp14:editId="0022B217">
-            <wp:extent cx="3334215" cy="3048425"/>
-            <wp:effectExtent l="0" t="0" r="0" b="0"/>
-            <wp:docPr id="1568272307" name="Picture 1"/>
-            <wp:cNvGraphicFramePr>
-              <a:graphicFrameLocks xmlns:a="http://schemas.openxmlformats.org/drawingml/2006/main" noChangeAspect="1"/>
-            </wp:cNvGraphicFramePr>
-            <a:graphic xmlns:a="http://schemas.openxmlformats.org/drawingml/2006/main">
-              <a:graphicData uri="http://schemas.openxmlformats.org/drawingml/2006/picture">
-                <pic:pic xmlns:pic="http://schemas.openxmlformats.org/drawingml/2006/picture">
-                  <pic:nvPicPr>
-                    <pic:cNvPr id="1568272307" name=""/>
-                    <pic:cNvPicPr/>
-                  </pic:nvPicPr>
-                  <pic:blipFill>
-                    <a:blip r:embed="rId21"/>
-                    <a:stretch>
-                      <a:fillRect/>
-                    </a:stretch>
-                  </pic:blipFill>
-                  <pic:spPr>
-                    <a:xfrm>
-                      <a:off x="0" y="0"/>
-                      <a:ext cx="3334215" cy="3048425"/>
-                    </a:xfrm>
-                    <a:prstGeom prst="rect">
-                      <a:avLst/>
-                    </a:prstGeom>
-                  </pic:spPr>
-                </pic:pic>
-              </a:graphicData>
-            </a:graphic>
-          </wp:inline>
-        </w:drawing>
-      </w:r>
-    </w:p>
-    <w:p>
-      <w:pPr>
-        <w:jc w:val="center"/>
-      </w:pPr>
-    </w:p>
-    <w:p>
-      <w:pPr>
-        <w:jc w:val="center"/>
-      </w:pPr>
-    </w:p>
-    <w:p>
-      <w:pPr>
-        <w:jc w:val="center"/>
-      </w:pPr>
-    </w:p>
-    <w:p>
-      <w:pPr>
-        <w:jc w:val="center"/>
-      </w:pPr>
-    </w:p>
-    <w:p>
-      <w:pPr>
-        <w:jc w:val="center"/>
-      </w:pPr>
-    </w:p>
-    <w:p>
-      <w:pPr>
-        <w:jc w:val="center"/>
-      </w:pPr>
-    </w:p>
-    <w:p>
-      <w:pPr>
-        <w:jc w:val="center"/>
-      </w:pPr>
-    </w:p>
-    <w:p>
-      <w:pPr>
-        <w:jc w:val="center"/>
-      </w:pPr>
-    </w:p>
-    <w:p>
-      <w:pPr>
-        <w:jc w:val="center"/>
-      </w:pPr>
-    </w:p>
-    <w:p>
-      <w:pPr>
-        <w:jc w:val="center"/>
-      </w:pPr>
-    </w:p>
-    <w:p>
-      <w:pPr>
-        <w:jc w:val="center"/>
-      </w:pPr>
-    </w:p>
-    <w:p>
-      <w:pPr>
-        <w:jc w:val="center"/>
-      </w:pPr>
-    </w:p>
-    <w:p>
-      <w:pPr>
-        <w:jc w:val="center"/>
-      </w:pPr>
-    </w:p>
-    <w:p>
-      <w:pPr>
-        <w:jc w:val="center"/>
-      </w:pPr>
-    </w:p>
-    <w:p>
-      <w:pPr>
-        <w:jc w:val="center"/>
-      </w:pPr>
-    </w:p>
-    <w:p>
-      <w:pPr>
-        <w:jc w:val="center"/>
-      </w:pPr>
-    </w:p>
-    <w:p>
-      <w:pPr>
-        <w:jc w:val="center"/>
-      </w:pPr>
-    </w:p>
-    <w:p>
-      <w:pPr>
-        <w:jc w:val="center"/>
-      </w:pPr>
-      <w:r>
-        <w:lastRenderedPageBreak/>
-        <w:t xml:space="preserve">12 – apos isso iremos acessar o computador 1 e acessar o servidor FTP pelo computador 1 e acessar o arquivo salvo dentro do servidor. Acessar menu computador 1 -&gt; Desktop -&gt; command prompt. Em seguida digitar </w:t>
-      </w:r>
-      <w:hyperlink w:history="1">
-        <w:r>
-          <w:rPr>
-            <w:rStyle w:val="Hyperlink"/>
-          </w:rPr>
-          <w:t>ftp 102.168.1.100</w:t>
-        </w:r>
-      </w:hyperlink>
-      <w:r>
-        <w:t xml:space="preserve"> para acessar o servidor, digitar o usuario e senha que ser admin admin, e digitar o comando para pegar o arquivo texto</w:t>
-      </w:r>
-    </w:p>
-    <w:p>
-      <w:pPr>
-        <w:jc w:val="center"/>
-      </w:pPr>
-      <w:r>
-        <w:drawing>
-          <wp:inline distT="0" distB="0" distL="0" distR="0" wp14:anchorId="597F2764" wp14:editId="7E1714DF">
-            <wp:extent cx="4791744" cy="3934374"/>
-            <wp:effectExtent l="0" t="0" r="8890" b="9525"/>
-            <wp:docPr id="874094289" name="Picture 1"/>
-            <wp:cNvGraphicFramePr>
-              <a:graphicFrameLocks xmlns:a="http://schemas.openxmlformats.org/drawingml/2006/main" noChangeAspect="1"/>
-            </wp:cNvGraphicFramePr>
-            <a:graphic xmlns:a="http://schemas.openxmlformats.org/drawingml/2006/main">
-              <a:graphicData uri="http://schemas.openxmlformats.org/drawingml/2006/picture">
-                <pic:pic xmlns:pic="http://schemas.openxmlformats.org/drawingml/2006/picture">
-                  <pic:nvPicPr>
-                    <pic:cNvPr id="874094289" name=""/>
-                    <pic:cNvPicPr/>
-                  </pic:nvPicPr>
-                  <pic:blipFill>
-                    <a:blip r:embed="rId22"/>
-                    <a:stretch>
-                      <a:fillRect/>
-                    </a:stretch>
-                  </pic:blipFill>
-                  <pic:spPr>
-                    <a:xfrm>
-                      <a:off x="0" y="0"/>
-                      <a:ext cx="4791744" cy="3934374"/>
-                    </a:xfrm>
-                    <a:prstGeom prst="rect">
-                      <a:avLst/>
-                    </a:prstGeom>
-                  </pic:spPr>
-                </pic:pic>
-              </a:graphicData>
-            </a:graphic>
-          </wp:inline>
-        </w:drawing>
-      </w:r>
-    </w:p>
-    <w:p>
-      <w:pPr>
-        <w:jc w:val="center"/>
-      </w:pPr>
-    </w:p>
-    <w:p>
-      <w:pPr>
-        <w:jc w:val="center"/>
-      </w:pPr>
-    </w:p>
-    <w:p>
-      <w:pPr>
-        <w:jc w:val="center"/>
-      </w:pPr>
-    </w:p>
-    <w:p>
-      <w:pPr>
-        <w:jc w:val="center"/>
-      </w:pPr>
-    </w:p>
-    <w:p>
-      <w:pPr>
-        <w:jc w:val="center"/>
-      </w:pPr>
-    </w:p>
-    <w:p>
-      <w:pPr>
-        <w:jc w:val="center"/>
-      </w:pPr>
-    </w:p>
-    <w:p>
-      <w:pPr>
-        <w:jc w:val="center"/>
-      </w:pPr>
-    </w:p>
-    <w:p>
-      <w:pPr>
-        <w:jc w:val="center"/>
-      </w:pPr>
-    </w:p>
-    <w:p>
-      <w:pPr>
-        <w:jc w:val="center"/>
-      </w:pPr>
-    </w:p>
-    <w:p>
-      <w:pPr>
-        <w:jc w:val="center"/>
-      </w:pPr>
-    </w:p>
-    <w:p>
-      <w:pPr>
-        <w:jc w:val="center"/>
-      </w:pPr>
-    </w:p>
-    <w:p>
-      <w:pPr>
-        <w:jc w:val="center"/>
-      </w:pPr>
-    </w:p>
-    <w:p>
-      <w:pPr>
-        <w:jc w:val="center"/>
-      </w:pPr>
-      <w:r>
-        <w:lastRenderedPageBreak/>
-        <w:t>13 – Apos fazer isso sera necessari</w:t>
-      </w:r>
-      <w:r>
-        <w:t>o acessar o text editor dentro do computador 1 para acessar o arquivo txt salvo. Apos verificar sera necessari apenas abrir para ver se foi o correto</w:t>
-      </w:r>
-    </w:p>
-    <w:p>
-      <w:pPr>
-        <w:jc w:val="center"/>
-      </w:pPr>
-      <w:r>
-        <w:drawing>
-          <wp:inline distT="0" distB="0" distL="0" distR="0" wp14:anchorId="7EF9D057" wp14:editId="05F02B13">
-            <wp:extent cx="5400040" cy="4201795"/>
-            <wp:effectExtent l="0" t="0" r="0" b="8255"/>
-            <wp:docPr id="1734398374" name="Picture 1"/>
-            <wp:cNvGraphicFramePr>
-              <a:graphicFrameLocks xmlns:a="http://schemas.openxmlformats.org/drawingml/2006/main" noChangeAspect="1"/>
-            </wp:cNvGraphicFramePr>
-            <a:graphic xmlns:a="http://schemas.openxmlformats.org/drawingml/2006/main">
-              <a:graphicData uri="http://schemas.openxmlformats.org/drawingml/2006/picture">
-                <pic:pic xmlns:pic="http://schemas.openxmlformats.org/drawingml/2006/picture">
-                  <pic:nvPicPr>
-                    <pic:cNvPr id="1734398374" name=""/>
-                    <pic:cNvPicPr/>
-                  </pic:nvPicPr>
-                  <pic:blipFill>
-                    <a:blip r:embed="rId23"/>
-                    <a:stretch>
-                      <a:fillRect/>
-                    </a:stretch>
-                  </pic:blipFill>
-                  <pic:spPr>
-                    <a:xfrm>
-                      <a:off x="0" y="0"/>
-                      <a:ext cx="5400040" cy="4201795"/>
-                    </a:xfrm>
-                    <a:prstGeom prst="rect">
-                      <a:avLst/>
-                    </a:prstGeom>
-                  </pic:spPr>
-                </pic:pic>
-              </a:graphicData>
-            </a:graphic>
-          </wp:inline>
-        </w:drawing>
-      </w:r>
-    </w:p>
-    <w:p>
-      <w:pPr>
-        <w:jc w:val="center"/>
-      </w:pPr>
-    </w:p>
-    <w:p>
-      <w:pPr>
-        <w:jc w:val="center"/>
-      </w:pPr>
-      <w:r>
-        <w:drawing>
-          <wp:inline distT="0" distB="0" distL="0" distR="0" wp14:anchorId="2E548936" wp14:editId="52790A31">
-            <wp:extent cx="5400040" cy="3035300"/>
-            <wp:effectExtent l="0" t="0" r="0" b="0"/>
-            <wp:docPr id="2013522296" name="Picture 1"/>
-            <wp:cNvGraphicFramePr>
-              <a:graphicFrameLocks xmlns:a="http://schemas.openxmlformats.org/drawingml/2006/main" noChangeAspect="1"/>
-            </wp:cNvGraphicFramePr>
-            <a:graphic xmlns:a="http://schemas.openxmlformats.org/drawingml/2006/main">
-              <a:graphicData uri="http://schemas.openxmlformats.org/drawingml/2006/picture">
-                <pic:pic xmlns:pic="http://schemas.openxmlformats.org/drawingml/2006/picture">
-                  <pic:nvPicPr>
-                    <pic:cNvPr id="2013522296" name=""/>
-                    <pic:cNvPicPr/>
-                  </pic:nvPicPr>
-                  <pic:blipFill>
-                    <a:blip r:embed="rId24"/>
-                    <a:stretch>
-                      <a:fillRect/>
-                    </a:stretch>
-                  </pic:blipFill>
-                  <pic:spPr>
-                    <a:xfrm>
-                      <a:off x="0" y="0"/>
-                      <a:ext cx="5400040" cy="3035300"/>
-                    </a:xfrm>
-                    <a:prstGeom prst="rect">
-                      <a:avLst/>
-                    </a:prstGeom>
-                  </pic:spPr>
-                </pic:pic>
-              </a:graphicData>
-            </a:graphic>
-          </wp:inline>
-        </w:drawing>
-      </w:r>
-    </w:p>
-    <w:p>
-      <w:pPr>
-        <w:jc w:val="center"/>
-        <w:rPr>
-          <w:b/>
-          <w:bCs/>
-        </w:rPr>
-      </w:pPr>
-    </w:p>
-    <w:p>
-      <w:pPr>
-        <w:jc w:val="center"/>
-        <w:rPr>
-          <w:b/>
-          <w:bCs/>
-        </w:rPr>
-      </w:pPr>
-      <w:r>
-        <w:rPr>
-          <w:b/>
-          <w:bCs/>
-        </w:rPr>
-        <w:lastRenderedPageBreak/>
-        <w:drawing>
-          <wp:inline distT="0" distB="0" distL="0" distR="0" wp14:anchorId="26C5C827" wp14:editId="339E1637">
-            <wp:extent cx="5400040" cy="1541780"/>
-            <wp:effectExtent l="0" t="0" r="0" b="1270"/>
-            <wp:docPr id="2088149612" name="Picture 1"/>
-            <wp:cNvGraphicFramePr>
-              <a:graphicFrameLocks xmlns:a="http://schemas.openxmlformats.org/drawingml/2006/main" noChangeAspect="1"/>
-            </wp:cNvGraphicFramePr>
-            <a:graphic xmlns:a="http://schemas.openxmlformats.org/drawingml/2006/main">
-              <a:graphicData uri="http://schemas.openxmlformats.org/drawingml/2006/picture">
-                <pic:pic xmlns:pic="http://schemas.openxmlformats.org/drawingml/2006/picture">
-                  <pic:nvPicPr>
-                    <pic:cNvPr id="2088149612" name=""/>
-                    <pic:cNvPicPr/>
-                  </pic:nvPicPr>
-                  <pic:blipFill>
-                    <a:blip r:embed="rId25"/>
-                    <a:stretch>
-                      <a:fillRect/>
-                    </a:stretch>
-                  </pic:blipFill>
-                  <pic:spPr>
-                    <a:xfrm>
-                      <a:off x="0" y="0"/>
-                      <a:ext cx="5400040" cy="1541780"/>
-                    </a:xfrm>
-                    <a:prstGeom prst="rect">
-                      <a:avLst/>
-                    </a:prstGeom>
-                  </pic:spPr>
-                </pic:pic>
-              </a:graphicData>
-            </a:graphic>
-          </wp:inline>
-        </w:drawing>
-      </w:r>
-    </w:p>
-    <w:p>
-      <w:pPr>
-        <w:jc w:val="center"/>
-        <w:rPr>
-          <w:b/>
-          <w:bCs/>
-        </w:rPr>
-      </w:pPr>
-    </w:p>
-    <w:p>
-      <w:pPr>
-        <w:jc w:val="center"/>
-        <w:rPr>
-          <w:b/>
-          <w:bCs/>
-        </w:rPr>
-      </w:pPr>
-    </w:p>
-    <w:p>
-      <w:pPr>
-        <w:jc w:val="center"/>
-        <w:rPr>
-          <w:b/>
-          <w:bCs/>
-        </w:rPr>
-      </w:pPr>
-    </w:p>
+      <w:r>
+        <w:t xml:space="preserve">2 – </w:t>
+      </w:r>
+      <w:r>
+        <w:t xml:space="preserve">Agora irei realizar as conexoes fisicas para o projeto. </w:t>
+      </w:r>
+    </w:p>
+    <w:p>
+      <w:pPr>
+        <w:pStyle w:val="ListParagraph"/>
+        <w:numPr>
+          <w:ilvl w:val="0"/>
+          <w:numId w:val="2"/>
+        </w:numPr>
+      </w:pPr>
+      <w:r>
+        <w:t xml:space="preserve">Primeiramente irei conectar o </w:t>
+      </w:r>
+      <w:r>
+        <w:t>roteador</w:t>
+      </w:r>
+      <w:r>
+        <w:t xml:space="preserve"> 2911 coffeshop pela porta GigaEthernet 0/0</w:t>
+      </w:r>
+      <w:r>
+        <w:t xml:space="preserve"> para a Ethernet6 no cloud</w:t>
+      </w:r>
+      <w:r>
+        <w:t>;</w:t>
+      </w:r>
+    </w:p>
+    <w:p>
+      <w:pPr>
+        <w:pStyle w:val="ListParagraph"/>
+        <w:numPr>
+          <w:ilvl w:val="0"/>
+          <w:numId w:val="2"/>
+        </w:numPr>
+      </w:pPr>
+      <w:r>
+        <w:t>Irei conectar o roteador 2911 coffeshop pela porta GigabitEthernet0/1 ao switch pela porta, eu acho, GigaBitEthernet 0/</w:t>
+      </w:r>
+      <w:r>
+        <w:t>1;</w:t>
+      </w:r>
+    </w:p>
+    <w:p>
+      <w:pPr>
+        <w:pStyle w:val="ListParagraph"/>
+        <w:numPr>
+          <w:ilvl w:val="0"/>
+          <w:numId w:val="2"/>
+        </w:numPr>
+      </w:pPr>
+      <w:r>
+        <w:t>Na porta do Switch FastEthernet0/1</w:t>
+      </w:r>
+    </w:p>
+    <w:p/>
+    <w:p>
+      <w:r>
+        <w:t xml:space="preserve">3 – </w:t>
+      </w:r>
+    </w:p>
+    <w:p/>
+    <w:p>
+      <w:r>
+        <w:t xml:space="preserve">4 – </w:t>
+      </w:r>
+    </w:p>
+    <w:p/>
     <w:p/>
     <w:p>
       <w:r>
@@ -2073,7 +1077,7 @@
         </w:numPr>
       </w:pPr>
       <w:r>
-        <w:t>Elimina a Configuração Manual (Economia de Tempo): Imagine ter que ir em cada PC de uma empresa com 500 computadores e digitar manualmente o IP, Máscara, Gateway e DNS. O DHCP faz isso em milissegundos.</w:t>
+        <w:t>Elimin.</w:t>
       </w:r>
     </w:p>
     <w:p>
@@ -2085,7 +1089,7 @@
         </w:numPr>
       </w:pPr>
       <w:r>
-        <w:t>Evita Conflitos de IP: Dois dispositivos na mesma rede não podem ter o mesmo IP, ou ambos perdem a conexão. O DHCP tem um banco de dados controle; ele sabe exatamente qual IP já foi entregue e qual está livre.</w:t>
+        <w:t>Ev.</w:t>
       </w:r>
     </w:p>
     <w:p>
@@ -2097,7 +1101,10 @@
         </w:numPr>
       </w:pPr>
       <w:r>
-        <w:t>Facilita a Mobilidade: Se você leva seu notebook da sala de reuniões para o seu escritório (que pode estar em outra rede/VLAN), o DHCP garante que ele receba as configurações corretas daquela rede específica automaticamente.</w:t>
+        <w:t>F</w:t>
+      </w:r>
+      <w:r>
+        <w:t>.</w:t>
       </w:r>
     </w:p>
     <w:p>
@@ -2109,7 +1116,10 @@
         </w:numPr>
       </w:pPr>
       <w:r>
-        <w:t>Gerenciamento Centralizado: Se você precisar mudar o servidor DNS da rede inteira, você muda apenas na configuração do DHCP. Os PCs vão receber a nova informação na próxima vez que se conectarem ou renovarem o aluguel do IP.</w:t>
+        <w:t>Gerenciamento Centralizado: Se você precisar mudar o servidor DNS da rede inteira, você</w:t>
+      </w:r>
+      <w:r>
+        <w:t>.</w:t>
       </w:r>
     </w:p>
     <w:p/>

</xml_diff>

<commit_message>
create models, componentes and conections in project
</commit_message>
<xml_diff>
--- a/001 - estudo pessoal/020 - Coffe Shop Network/Manual Passo a Passo servidor de email.docx
+++ b/001 - estudo pessoal/020 - Coffe Shop Network/Manual Passo a Passo servidor de email.docx
@@ -577,6 +577,9 @@
         <w:jc w:val="center"/>
       </w:pPr>
       <w:r>
+        <w:rPr>
+          <w:noProof/>
+        </w:rPr>
         <w:drawing>
           <wp:inline distT="0" distB="0" distL="0" distR="0" wp14:anchorId="42EE7296" wp14:editId="288DB9D3">
             <wp:extent cx="4333875" cy="2889250"/>
@@ -633,6 +636,9 @@
         <w:jc w:val="center"/>
       </w:pPr>
       <w:r>
+        <w:rPr>
+          <w:noProof/>
+        </w:rPr>
         <w:drawing>
           <wp:inline distT="0" distB="0" distL="0" distR="0" wp14:anchorId="06F63AE4" wp14:editId="15871152">
             <wp:extent cx="3848100" cy="2567695"/>
@@ -692,6 +698,9 @@
         <w:jc w:val="center"/>
       </w:pPr>
       <w:r>
+        <w:rPr>
+          <w:noProof/>
+        </w:rPr>
         <w:lastRenderedPageBreak/>
         <w:drawing>
           <wp:inline distT="0" distB="0" distL="0" distR="0" wp14:anchorId="79D31C53" wp14:editId="0049FAE4">
@@ -752,6 +761,9 @@
         <w:jc w:val="center"/>
       </w:pPr>
       <w:r>
+        <w:rPr>
+          <w:noProof/>
+        </w:rPr>
         <w:drawing>
           <wp:inline distT="0" distB="0" distL="0" distR="0" wp14:anchorId="57674317" wp14:editId="1E503677">
             <wp:extent cx="4276725" cy="2846050"/>
@@ -833,6 +845,9 @@
     </w:p>
     <w:p>
       <w:r>
+        <w:rPr>
+          <w:noProof/>
+        </w:rPr>
         <w:drawing>
           <wp:inline distT="0" distB="0" distL="0" distR="0" wp14:anchorId="4B0FCC03" wp14:editId="661C04C7">
             <wp:extent cx="5400040" cy="3435985"/>
@@ -871,12 +886,67 @@
       </w:r>
     </w:p>
     <w:p/>
-    <w:p>
-      <w:r>
+    <w:p/>
+    <w:p/>
+    <w:p/>
+    <w:p/>
+    <w:p/>
+    <w:p/>
+    <w:p/>
+    <w:p/>
+    <w:p/>
+    <w:p/>
+    <w:p/>
+    <w:p/>
+    <w:p>
+      <w:r>
+        <w:lastRenderedPageBreak/>
         <w:t xml:space="preserve">2 – </w:t>
       </w:r>
       <w:r>
         <w:t xml:space="preserve">Agora irei realizar as conexoes fisicas para o projeto. </w:t>
+      </w:r>
+    </w:p>
+    <w:p>
+      <w:pPr>
+        <w:jc w:val="center"/>
+      </w:pPr>
+      <w:r>
+        <w:drawing>
+          <wp:inline distT="0" distB="0" distL="0" distR="0" wp14:anchorId="550C8E69" wp14:editId="2601E5B0">
+            <wp:extent cx="5832043" cy="3857625"/>
+            <wp:effectExtent l="0" t="0" r="0" b="0"/>
+            <wp:docPr id="951732931" name="Picture 1"/>
+            <wp:cNvGraphicFramePr>
+              <a:graphicFrameLocks xmlns:a="http://schemas.openxmlformats.org/drawingml/2006/main" noChangeAspect="1"/>
+            </wp:cNvGraphicFramePr>
+            <a:graphic xmlns:a="http://schemas.openxmlformats.org/drawingml/2006/main">
+              <a:graphicData uri="http://schemas.openxmlformats.org/drawingml/2006/picture">
+                <pic:pic xmlns:pic="http://schemas.openxmlformats.org/drawingml/2006/picture">
+                  <pic:nvPicPr>
+                    <pic:cNvPr id="951732931" name=""/>
+                    <pic:cNvPicPr/>
+                  </pic:nvPicPr>
+                  <pic:blipFill>
+                    <a:blip r:embed="rId11"/>
+                    <a:stretch>
+                      <a:fillRect/>
+                    </a:stretch>
+                  </pic:blipFill>
+                  <pic:spPr>
+                    <a:xfrm>
+                      <a:off x="0" y="0"/>
+                      <a:ext cx="5836013" cy="3860251"/>
+                    </a:xfrm>
+                    <a:prstGeom prst="rect">
+                      <a:avLst/>
+                    </a:prstGeom>
+                  </pic:spPr>
+                </pic:pic>
+              </a:graphicData>
+            </a:graphic>
+          </wp:inline>
+        </w:drawing>
       </w:r>
     </w:p>
     <w:p>
@@ -927,8 +997,67 @@
         </w:numPr>
       </w:pPr>
       <w:r>
-        <w:t>Na porta do Switch FastEthernet0/1</w:t>
-      </w:r>
+        <w:t>Conectar um cabo n</w:t>
+      </w:r>
+      <w:r>
+        <w:t>a porta do Switch FastEthernet0/1</w:t>
+      </w:r>
+      <w:r>
+        <w:t xml:space="preserve"> na porta FastEthernet0 do computador do gerente;</w:t>
+      </w:r>
+    </w:p>
+    <w:p>
+      <w:pPr>
+        <w:pStyle w:val="ListParagraph"/>
+        <w:numPr>
+          <w:ilvl w:val="0"/>
+          <w:numId w:val="2"/>
+        </w:numPr>
+      </w:pPr>
+      <w:r>
+        <w:t>No switch conectar na porta FastEthernet0/2 a impressora da gerencia na unica porta da impressora FastEthernet0;</w:t>
+      </w:r>
+    </w:p>
+    <w:p>
+      <w:pPr>
+        <w:pStyle w:val="ListParagraph"/>
+        <w:numPr>
+          <w:ilvl w:val="0"/>
+          <w:numId w:val="2"/>
+        </w:numPr>
+      </w:pPr>
+      <w:r>
+        <w:t>No switch conectar na porta FastEthernet0/6 ao computador do caixa na posta FastEthernet0;</w:t>
+      </w:r>
+    </w:p>
+    <w:p>
+      <w:pPr>
+        <w:pStyle w:val="ListParagraph"/>
+        <w:numPr>
+          <w:ilvl w:val="0"/>
+          <w:numId w:val="2"/>
+        </w:numPr>
+      </w:pPr>
+      <w:r>
+        <w:t>No switch conectar na porta FastEthernet0/7 a impressora do caixa na porta FastEthernet0;</w:t>
+      </w:r>
+    </w:p>
+    <w:p>
+      <w:pPr>
+        <w:pStyle w:val="ListParagraph"/>
+        <w:numPr>
+          <w:ilvl w:val="0"/>
+          <w:numId w:val="2"/>
+        </w:numPr>
+      </w:pPr>
+      <w:r>
+        <w:t>No switch conectar na porta FastEthernet0/11 ao ponto de acesso na porta 0.</w:t>
+      </w:r>
+    </w:p>
+    <w:p>
+      <w:pPr>
+        <w:ind w:left="360"/>
+      </w:pPr>
     </w:p>
     <w:p/>
     <w:p>

</xml_diff>